<commit_message>
Cyber report: write "no date" as N.D. throughout (UGM Harvard)
Changed the 11 remaining "n.d." to "N.D." in the in-text citations and
reference list (NIST, FBI, CISA), so the report uses one style. No other
words changed; Word and PDF rebuilt, still 17 pages.

Co-Authored-By: Claude Opus 5.5 <noreply@anthropic.com>
</commit_message>
<xml_diff>
--- a/04_Cyber_Security_Awareness/Cyber_Security_Awareness_Report.docx
+++ b/04_Cyber_Security_Awareness/Cyber_Security_Awareness_Report.docx
@@ -706,7 +706,7 @@
       </w:pPr>
       <w:r>
         <w:rPr/>
-        <w:t>Section 3 covers phishing, a form of social engineering in which attackers impersonate trusted individuals or organisations to deceive victims into revealing sensitive information, transferring money or carrying out unsafe actions (National Institute of Standards and Technology, n.d.). Phishing takes several forms and often relies on psychological manipulation to make a victim more likely to respond.</w:t>
+        <w:t>Section 3 covers phishing, a form of social engineering in which attackers impersonate trusted individuals or organisations to deceive victims into revealing sensitive information, transferring money or carrying out unsafe actions (National Institute of Standards and Technology, N.D.). Phishing takes several forms and often relies on psychological manipulation to make a victim more likely to respond.</w:t>
       </w:r>
     </w:p>
     <w:p>
@@ -1605,7 +1605,7 @@
       </w:pPr>
       <w:r>
         <w:rPr/>
-        <w:t>Phishing is a type of social engineering attack in which criminals impersonate a trusted organisation or individual in order to persuade victims to disclose sensitive information, transfer money, or visit a malicious website (National Institute of Standards and Technology, n.d.).</w:t>
+        <w:t>Phishing is a type of social engineering attack in which criminals impersonate a trusted organisation or individual in order to persuade victims to disclose sensitive information, transfer money, or visit a malicious website (National Institute of Standards and Technology, N.D.).</w:t>
       </w:r>
     </w:p>
     <w:p>
@@ -1703,7 +1703,7 @@
       </w:pPr>
       <w:r>
         <w:rPr/>
-        <w:t>Smishing is phishing conducted through SMS or other text messages. Attackers commonly use messages containing malicious links or other deceptive instructions to persuade victims to provide personal or financial information (Federal Bureau of Investigation, n.d.b).</w:t>
+        <w:t>Smishing is phishing conducted through SMS or other text messages. Attackers commonly use messages containing malicious links or other deceptive instructions to persuade victims to provide personal or financial information (Federal Bureau of Investigation, N.D.b).</w:t>
       </w:r>
     </w:p>
     <w:p>
@@ -1752,7 +1752,7 @@
       </w:pPr>
       <w:r>
         <w:rPr/>
-        <w:t>Vishing is phishing carried out through phone calls, voice messages or Voice over Internet Protocol (VoIP). Attackers may impersonate an official organisation, such as a bank or government department, to gain trust and request personal information (Federal Bureau of Investigation, n.d.b; NCSC, 2021b).</w:t>
+        <w:t>Vishing is phishing carried out through phone calls, voice messages or Voice over Internet Protocol (VoIP). Attackers may impersonate an official organisation, such as a bank or government department, to gain trust and request personal information (Federal Bureau of Investigation, N.D.b; NCSC, 2021b).</w:t>
       </w:r>
     </w:p>
     <w:p>
@@ -1801,7 +1801,7 @@
       </w:pPr>
       <w:r>
         <w:rPr/>
-        <w:t>Business Email Compromise usually targets organisations. Attackers may spoof or compromise email accounts and impersonate a colleague, manager, executive or trusted business contact. BEC often aims to persuade the victim to make a financial transfer or change payment details (Federal Bureau of Investigation, n.d.a).</w:t>
+        <w:t>Business Email Compromise usually targets organisations. Attackers may spoof or compromise email accounts and impersonate a colleague, manager, executive or trusted business contact. BEC often aims to persuade the victim to make a financial transfer or change payment details (Federal Bureau of Investigation, N.D.a).</w:t>
       </w:r>
     </w:p>
     <w:p>
@@ -2163,7 +2163,7 @@
       </w:pPr>
       <w:r>
         <w:rPr/>
-        <w:t>The sender’s email address should be checked carefully because attackers may create addresses that differ from legitimate ones by only a single letter, number or symbol (Federal Bureau of Investigation, n.d.b).</w:t>
+        <w:t>The sender’s email address should be checked carefully because attackers may create addresses that differ from legitimate ones by only a single letter, number or symbol (Federal Bureau of Investigation, N.D.b).</w:t>
       </w:r>
     </w:p>
     <w:p>
@@ -2518,7 +2518,7 @@
       </w:pPr>
       <w:r>
         <w:rPr/>
-        <w:t>Encryption, screen locks, and security software protect various parts of the device. Encryption scrambles data so that it cannot be read without the right key. According to NIST, encryption separates the data; therefore, only authorised key holders can access it, limiting exposure in the event of a lost or stolen device (Howell et al., 2023). CISA also advises data encryption of computers, mobile gadgets, hard disks, and other pertinent files to prevent unauthorised access to data (CISA, n.d.). A screen lock stops other people from using the device, and it can use a password, a PIN or a fingerprint. Automatic lockouts lock the device after it has not been used for a while, so an unattended device cannot be used by someone else. Encryption and screen locking work hand in hand: the lock prevents access on the spot, and the encryption protects the stored data if someone tries to get around the normal login. Devices should also use reputable antivirus or endpoint security software, which can identify, prevent, or quarantine malware. According to the NCSC, modern security tools interact with operating system controls and should be updated to ensure new malware signatures and safeguards stay viable (NCSC, 2021e).</w:t>
+        <w:t>Encryption, screen locks, and security software protect various parts of the device. Encryption scrambles data so that it cannot be read without the right key. According to NIST, encryption separates the data; therefore, only authorised key holders can access it, limiting exposure in the event of a lost or stolen device (Howell et al., 2023). CISA also advises data encryption of computers, mobile gadgets, hard disks, and other pertinent files to prevent unauthorised access to data (CISA, N.D.). A screen lock stops other people from using the device, and it can use a password, a PIN or a fingerprint. Automatic lockouts lock the device after it has not been used for a while, so an unattended device cannot be used by someone else. Encryption and screen locking work hand in hand: the lock prevents access on the spot, and the encryption protects the stored data if someone tries to get around the normal login. Devices should also use reputable antivirus or endpoint security software, which can identify, prevent, or quarantine malware. According to the NCSC, modern security tools interact with operating system controls and should be updated to ensure new malware signatures and safeguards stay viable (NCSC, 2021e).</w:t>
       </w:r>
       <w:bookmarkEnd w:id="38"/>
     </w:p>
@@ -2718,7 +2718,7 @@
       </w:pPr>
       <w:r>
         <w:rPr/>
-        <w:t xml:space="preserve">Cybersecurity and Infrastructure Security Agency [CISA]. (n.d.) </w:t>
+        <w:t xml:space="preserve">Cybersecurity and Infrastructure Security Agency [CISA]. (N.D.) </w:t>
       </w:r>
       <w:r>
         <w:rPr>
@@ -2823,7 +2823,7 @@
       </w:pPr>
       <w:r>
         <w:rPr/>
-        <w:t xml:space="preserve">Federal Bureau of Investigation. (n.d.a) </w:t>
+        <w:t xml:space="preserve">Federal Bureau of Investigation. (N.D.a) </w:t>
       </w:r>
       <w:r>
         <w:rPr>
@@ -2844,7 +2844,7 @@
       </w:pPr>
       <w:r>
         <w:rPr/>
-        <w:t xml:space="preserve">Federal Bureau of Investigation. (n.d.b) </w:t>
+        <w:t xml:space="preserve">Federal Bureau of Investigation. (N.D.b) </w:t>
       </w:r>
       <w:r>
         <w:rPr>
@@ -3285,7 +3285,7 @@
       </w:pPr>
       <w:r>
         <w:rPr/>
-        <w:t xml:space="preserve">National Institute of Standards and Technology. (n.d.) </w:t>
+        <w:t xml:space="preserve">National Institute of Standards and Technology. (N.D.) </w:t>
       </w:r>
       <w:r>
         <w:rPr>

</xml_diff>